<commit_message>
E33: fișiere pe variante A, B, C
</commit_message>
<xml_diff>
--- a/fise/Fisa_E33_Simulare_proba_practica_de_examen.docx
+++ b/fise/Fisa_E33_Simulare_proba_practica_de_examen.docx
@@ -84,14 +84,14 @@
           <w:b w:val="0"/>
           <w:sz w:val="24"/>
         </w:rPr>
-        <w:t xml:space="preserve"> Primești, ca la examen, o variantă cu </w:t>
+        <w:t xml:space="preserve"> Ca la examen, fiecare cursant primește </w:t>
       </w:r>
       <w:r>
         <w:rPr>
           <w:b/>
           <w:sz w:val="24"/>
         </w:rPr>
-        <w:t>2 cerințe</w:t>
+        <w:t>o variantă cu 2 cerințe</w:t>
       </w:r>
       <w:r>
         <w:rPr>
@@ -126,7 +126,21 @@
           <w:b w:val="0"/>
           <w:sz w:val="24"/>
         </w:rPr>
-        <w:t xml:space="preserve"> cu care trimiți rezultatul. Lucrezi contra cronometru: </w:t>
+        <w:t xml:space="preserve"> cu care trimiți rezultatul. Sunt </w:t>
+      </w:r>
+      <w:r>
+        <w:rPr>
+          <w:b/>
+          <w:sz w:val="24"/>
+        </w:rPr>
+        <w:t>3 variante (A, B, C)</w:t>
+      </w:r>
+      <w:r>
+        <w:rPr>
+          <w:b w:val="0"/>
+          <w:sz w:val="24"/>
+        </w:rPr>
+        <w:t xml:space="preserve">, cu teme și destinatari diferiți. Lucrezi contra cronometru: </w:t>
       </w:r>
       <w:r>
         <w:rPr>
@@ -411,7 +425,7 @@
           <w:color w:val="1F3A5F"/>
           <w:sz w:val="28"/>
         </w:rPr>
-        <w:t>Fișierul de pornire</w:t>
+        <w:t>Fișierele de pornire</w:t>
       </w:r>
     </w:p>
     <w:p>
@@ -420,17 +434,340 @@
       </w:pPr>
       <w:r>
         <w:rPr>
+          <w:b w:val="0"/>
+          <w:sz w:val="24"/>
+        </w:rPr>
+        <w:t xml:space="preserve">Subiectul de examen pentru varianta ta și foaia de răspuns pentru căutare. Sunt 3 fișiere, câte unul pentru fiecare variantă: îl descarci doar pe al tău. Le descarci de pe site, de pe pagina exercițiului: </w:t>
+      </w:r>
+      <w:r>
+        <w:rPr>
           <w:rFonts w:ascii="Consolas" w:hAnsi="Consolas" w:eastAsia="Consolas"/>
           <w:sz w:val="24"/>
         </w:rPr>
-        <w:t>E33_Simulare_PORNIRE.docx</w:t>
+        <w:t>E33_Simulare_A_PORNIRE.docx</w:t>
       </w:r>
       <w:r>
         <w:rPr>
           <w:b w:val="0"/>
           <w:sz w:val="24"/>
         </w:rPr>
-        <w:t>: Subiectul de examen (varianta de exercițiu) și foaia de răspuns pentru căutare. Îl descarci de pe site, de pe pagina exercițiului.</w:t>
+        <w:t xml:space="preserve">, </w:t>
+      </w:r>
+      <w:r>
+        <w:rPr>
+          <w:rFonts w:ascii="Consolas" w:hAnsi="Consolas" w:eastAsia="Consolas"/>
+          <w:sz w:val="24"/>
+        </w:rPr>
+        <w:t>E33_Simulare_B_PORNIRE.docx</w:t>
+      </w:r>
+      <w:r>
+        <w:rPr>
+          <w:b w:val="0"/>
+          <w:sz w:val="24"/>
+        </w:rPr>
+        <w:t xml:space="preserve">, </w:t>
+      </w:r>
+      <w:r>
+        <w:rPr>
+          <w:rFonts w:ascii="Consolas" w:hAnsi="Consolas" w:eastAsia="Consolas"/>
+          <w:sz w:val="24"/>
+        </w:rPr>
+        <w:t>E33_Simulare_C_PORNIRE.docx</w:t>
+      </w:r>
+      <w:r>
+        <w:rPr>
+          <w:b w:val="0"/>
+          <w:sz w:val="24"/>
+        </w:rPr>
+        <w:t>.</w:t>
+      </w:r>
+    </w:p>
+    <w:p>
+      <w:pPr>
+        <w:keepNext/>
+        <w:spacing w:after="80" w:before="160"/>
+      </w:pPr>
+      <w:r>
+        <w:rPr>
+          <w:b/>
+          <w:color w:val="1F3A5F"/>
+          <w:sz w:val="28"/>
+        </w:rPr>
+        <w:t>Textul pe care îl folosești</w:t>
+      </w:r>
+    </w:p>
+    <w:tbl>
+      <w:tblPr>
+        <w:tblStyle w:val="TableGrid"/>
+        <w:tblW w:type="auto" w:w="0"/>
+        <w:tblLayout w:type="fixed"/>
+        <w:tblLook w:firstColumn="1" w:firstRow="1" w:lastColumn="0" w:lastRow="0" w:noHBand="0" w:noVBand="1" w:val="04A0"/>
+      </w:tblPr>
+      <w:tblGrid>
+        <w:gridCol w:w="726"/>
+        <w:gridCol w:w="3119"/>
+        <w:gridCol w:w="3342"/>
+        <w:gridCol w:w="2450"/>
+      </w:tblGrid>
+      <w:tr>
+        <w:trPr>
+          <w:tblHeader w:val="true"/>
+        </w:trPr>
+        <w:tc>
+          <w:tcPr>
+            <w:tcW w:type="dxa" w:w="727"/>
+            <w:shd w:val="clear" w:color="auto" w:fill="DCE6F1"/>
+          </w:tcPr>
+          <w:p>
+            <w:r/>
+            <w:r>
+              <w:rPr>
+                <w:b/>
+                <w:sz w:val="21"/>
+              </w:rPr>
+              <w:t>Varianta</w:t>
+            </w:r>
+          </w:p>
+        </w:tc>
+        <w:tc>
+          <w:tcPr>
+            <w:tcW w:type="dxa" w:w="3119"/>
+            <w:shd w:val="clear" w:color="auto" w:fill="DCE6F1"/>
+          </w:tcPr>
+          <w:p>
+            <w:r/>
+            <w:r>
+              <w:rPr>
+                <w:b/>
+                <w:sz w:val="21"/>
+              </w:rPr>
+              <w:t>Cerința 1 – cauți despre</w:t>
+            </w:r>
+          </w:p>
+        </w:tc>
+        <w:tc>
+          <w:tcPr>
+            <w:tcW w:type="dxa" w:w="3342"/>
+            <w:shd w:val="clear" w:color="auto" w:fill="DCE6F1"/>
+          </w:tcPr>
+          <w:p>
+            <w:r/>
+            <w:r>
+              <w:rPr>
+                <w:b/>
+                <w:sz w:val="21"/>
+              </w:rPr>
+              <w:t>Cerința 2 – e-mail către</w:t>
+            </w:r>
+          </w:p>
+        </w:tc>
+        <w:tc>
+          <w:tcPr>
+            <w:tcW w:type="dxa" w:w="2451"/>
+            <w:shd w:val="clear" w:color="auto" w:fill="DCE6F1"/>
+          </w:tcPr>
+          <w:p>
+            <w:r/>
+            <w:r>
+              <w:rPr>
+                <w:b/>
+                <w:sz w:val="21"/>
+              </w:rPr>
+              <w:t>Cine primește varianta</w:t>
+            </w:r>
+          </w:p>
+        </w:tc>
+      </w:tr>
+      <w:tr>
+        <w:tc>
+          <w:tcPr>
+            <w:tcW w:type="dxa" w:w="727"/>
+          </w:tcPr>
+          <w:p>
+            <w:r>
+              <w:rPr>
+                <w:b w:val="0"/>
+                <w:sz w:val="21"/>
+              </w:rPr>
+              <w:t>A</w:t>
+            </w:r>
+          </w:p>
+        </w:tc>
+        <w:tc>
+          <w:tcPr>
+            <w:tcW w:type="dxa" w:w="3119"/>
+          </w:tcPr>
+          <w:p>
+            <w:r>
+              <w:rPr>
+                <w:b w:val="0"/>
+                <w:sz w:val="21"/>
+              </w:rPr>
+              <w:t>autentificarea în doi pași</w:t>
+            </w:r>
+          </w:p>
+        </w:tc>
+        <w:tc>
+          <w:tcPr>
+            <w:tcW w:type="dxa" w:w="3342"/>
+          </w:tcPr>
+          <w:p>
+            <w:r>
+              <w:rPr>
+                <w:b w:val="0"/>
+                <w:sz w:val="21"/>
+              </w:rPr>
+              <w:t>angajatorul tău</w:t>
+            </w:r>
+          </w:p>
+        </w:tc>
+        <w:tc>
+          <w:tcPr>
+            <w:tcW w:type="dxa" w:w="2451"/>
+          </w:tcPr>
+          <w:p>
+            <w:r>
+              <w:rPr>
+                <w:b w:val="0"/>
+                <w:sz w:val="21"/>
+              </w:rPr>
+              <w:t>numele de familie începe cu A – F</w:t>
+            </w:r>
+          </w:p>
+        </w:tc>
+      </w:tr>
+      <w:tr>
+        <w:tc>
+          <w:tcPr>
+            <w:tcW w:type="dxa" w:w="727"/>
+          </w:tcPr>
+          <w:p>
+            <w:r>
+              <w:rPr>
+                <w:b w:val="0"/>
+                <w:sz w:val="21"/>
+              </w:rPr>
+              <w:t>B</w:t>
+            </w:r>
+          </w:p>
+        </w:tc>
+        <w:tc>
+          <w:tcPr>
+            <w:tcW w:type="dxa" w:w="3119"/>
+          </w:tcPr>
+          <w:p>
+            <w:r>
+              <w:rPr>
+                <w:b w:val="0"/>
+                <w:sz w:val="21"/>
+              </w:rPr>
+              <w:t>managerul de parole</w:t>
+            </w:r>
+          </w:p>
+        </w:tc>
+        <w:tc>
+          <w:tcPr>
+            <w:tcW w:type="dxa" w:w="3342"/>
+          </w:tcPr>
+          <w:p>
+            <w:r>
+              <w:rPr>
+                <w:b w:val="0"/>
+                <w:sz w:val="21"/>
+              </w:rPr>
+              <w:t>profesorul tău</w:t>
+            </w:r>
+          </w:p>
+        </w:tc>
+        <w:tc>
+          <w:tcPr>
+            <w:tcW w:type="dxa" w:w="2451"/>
+          </w:tcPr>
+          <w:p>
+            <w:r>
+              <w:rPr>
+                <w:b w:val="0"/>
+                <w:sz w:val="21"/>
+              </w:rPr>
+              <w:t>numele de familie începe cu G – O</w:t>
+            </w:r>
+          </w:p>
+        </w:tc>
+      </w:tr>
+      <w:tr>
+        <w:tc>
+          <w:tcPr>
+            <w:tcW w:type="dxa" w:w="727"/>
+          </w:tcPr>
+          <w:p>
+            <w:r>
+              <w:rPr>
+                <w:b w:val="0"/>
+                <w:sz w:val="21"/>
+              </w:rPr>
+              <w:t>C</w:t>
+            </w:r>
+          </w:p>
+        </w:tc>
+        <w:tc>
+          <w:tcPr>
+            <w:tcW w:type="dxa" w:w="3119"/>
+          </w:tcPr>
+          <w:p>
+            <w:r>
+              <w:rPr>
+                <w:b w:val="0"/>
+                <w:sz w:val="21"/>
+              </w:rPr>
+              <w:t>copia de siguranță (backupul) a fișierelor</w:t>
+            </w:r>
+          </w:p>
+        </w:tc>
+        <w:tc>
+          <w:tcPr>
+            <w:tcW w:type="dxa" w:w="3342"/>
+          </w:tcPr>
+          <w:p>
+            <w:r>
+              <w:rPr>
+                <w:b w:val="0"/>
+                <w:sz w:val="21"/>
+              </w:rPr>
+              <w:t>șefa ta, Ana Rusu (inventată), cu o propunere</w:t>
+            </w:r>
+          </w:p>
+        </w:tc>
+        <w:tc>
+          <w:tcPr>
+            <w:tcW w:type="dxa" w:w="2451"/>
+          </w:tcPr>
+          <w:p>
+            <w:r>
+              <w:rPr>
+                <w:b w:val="0"/>
+                <w:sz w:val="21"/>
+              </w:rPr>
+              <w:t>numele de familie începe cu P – Z</w:t>
+            </w:r>
+          </w:p>
+        </w:tc>
+      </w:tr>
+    </w:tbl>
+    <w:p>
+      <w:pPr>
+        <w:spacing w:after="40"/>
+      </w:pPr>
+    </w:p>
+    <w:p>
+      <w:pPr>
+        <w:spacing w:after="80" w:before="0"/>
+      </w:pPr>
+      <w:r>
+        <w:rPr>
+          <w:b w:val="0"/>
+          <w:sz w:val="24"/>
+        </w:rPr>
+        <w:t>Literele cu diacritice se citesc fără ele: Ă și Â ca A, Î ca I, Ș ca S, Ț ca T. Dacă formatorul îți dă altă variantă, lucrezi pe aceea.</w:t>
       </w:r>
     </w:p>
     <w:p>
@@ -457,7 +794,48 @@
           <w:b w:val="0"/>
           <w:sz w:val="24"/>
         </w:rPr>
-        <w:t xml:space="preserve">1. Pornește o numărătoare inversă de </w:t>
+        <w:t xml:space="preserve">1. Află-ți </w:t>
+      </w:r>
+      <w:r>
+        <w:rPr>
+          <w:b/>
+          <w:sz w:val="24"/>
+        </w:rPr>
+        <w:t>varianta</w:t>
+      </w:r>
+      <w:r>
+        <w:rPr>
+          <w:b w:val="0"/>
+          <w:sz w:val="24"/>
+        </w:rPr>
+        <w:t xml:space="preserve"> din tabelul „</w:t>
+      </w:r>
+      <w:r>
+        <w:rPr>
+          <w:b/>
+          <w:sz w:val="24"/>
+        </w:rPr>
+        <w:t>Textul pe care îl folosești</w:t>
+      </w:r>
+      <w:r>
+        <w:rPr>
+          <w:b w:val="0"/>
+          <w:sz w:val="24"/>
+        </w:rPr>
+        <w:t>” (după prima literă a numelui de familie) și descarcă fișierul de pornire al variantei tale.</w:t>
+      </w:r>
+    </w:p>
+    <w:p>
+      <w:pPr>
+        <w:spacing w:after="60" w:before="0"/>
+        <w:ind w:left="454" w:hanging="283"/>
+      </w:pPr>
+      <w:r>
+        <w:rPr>
+          <w:b w:val="0"/>
+          <w:sz w:val="24"/>
+        </w:rPr>
+        <w:t xml:space="preserve">2. Pornește o numărătoare inversă de </w:t>
       </w:r>
       <w:r>
         <w:rPr>
@@ -540,21 +918,7 @@
           <w:b w:val="0"/>
           <w:sz w:val="24"/>
         </w:rPr>
-        <w:t xml:space="preserve">2. Descarcă </w:t>
-      </w:r>
-      <w:r>
-        <w:rPr>
-          <w:b/>
-          <w:sz w:val="24"/>
-        </w:rPr>
-        <w:t>fișierul de pornire</w:t>
-      </w:r>
-      <w:r>
-        <w:rPr>
-          <w:b w:val="0"/>
-          <w:sz w:val="24"/>
-        </w:rPr>
-        <w:t xml:space="preserve">, apasă </w:t>
+        <w:t xml:space="preserve">3. Deschide fișierul, apasă </w:t>
       </w:r>
       <w:r>
         <w:rPr>
@@ -609,21 +973,21 @@
           <w:b w:val="0"/>
           <w:sz w:val="24"/>
         </w:rPr>
-        <w:t>3. Caută „</w:t>
+        <w:t xml:space="preserve">4. Caută </w:t>
       </w:r>
       <w:r>
         <w:rPr>
           <w:b/>
           <w:sz w:val="24"/>
         </w:rPr>
-        <w:t>autentificarea în doi pași</w:t>
+        <w:t>tema variantei tale</w:t>
       </w:r>
       <w:r>
         <w:rPr>
           <w:b w:val="0"/>
           <w:sz w:val="24"/>
         </w:rPr>
-        <w:t>”. Scrie în tabel cuvintele-cheie exacte pe care le-ai tastat.</w:t>
+        <w:t>. Scrie în tabel cuvintele-cheie exacte pe care le-ai tastat.</w:t>
       </w:r>
     </w:p>
     <w:p>
@@ -636,7 +1000,7 @@
           <w:b w:val="0"/>
           <w:sz w:val="24"/>
         </w:rPr>
-        <w:t xml:space="preserve">4. Treci peste rezultatele marcate </w:t>
+        <w:t xml:space="preserve">5. Treci peste rezultatele marcate </w:t>
       </w:r>
       <w:r>
         <w:rPr>
@@ -733,7 +1097,7 @@
           <w:b w:val="0"/>
           <w:sz w:val="24"/>
         </w:rPr>
-        <w:t xml:space="preserve">5. Completează rândurile: </w:t>
+        <w:t xml:space="preserve">6. Completează rândurile: </w:t>
       </w:r>
       <w:r>
         <w:rPr>
@@ -816,7 +1180,7 @@
           <w:b w:val="0"/>
           <w:sz w:val="24"/>
         </w:rPr>
-        <w:t xml:space="preserve">6. Scrie, cu cuvintele tale, ce ai aflat (2–3 propoziții). Fă o captură cu pagina de rezultate și lipește-o (ghidurile </w:t>
+        <w:t xml:space="preserve">7. Scrie, cu cuvintele tale, ce ai aflat (2–3 propoziții). Fă o captură cu pagina de rezultate și lipește-o (ghidurile </w:t>
       </w:r>
       <w:r>
         <w:rPr>
@@ -884,7 +1248,62 @@
           <w:b w:val="0"/>
           <w:sz w:val="24"/>
         </w:rPr>
-        <w:t xml:space="preserve">1. Deschide e-mailul tău și apasă </w:t>
+        <w:t xml:space="preserve">1. Citește în fișierul variantei tale </w:t>
+      </w:r>
+      <w:r>
+        <w:rPr>
+          <w:b/>
+          <w:sz w:val="24"/>
+        </w:rPr>
+        <w:t>cui</w:t>
+      </w:r>
+      <w:r>
+        <w:rPr>
+          <w:b w:val="0"/>
+          <w:sz w:val="24"/>
+        </w:rPr>
+        <w:t xml:space="preserve"> scrii și </w:t>
+      </w:r>
+      <w:r>
+        <w:rPr>
+          <w:b/>
+          <w:sz w:val="24"/>
+        </w:rPr>
+        <w:t>ce</w:t>
+      </w:r>
+      <w:r>
+        <w:rPr>
+          <w:b w:val="0"/>
+          <w:sz w:val="24"/>
+        </w:rPr>
+        <w:t xml:space="preserve"> îi ceri (angajatorul, profesorul sau șefa). Formatorul joacă rolul acelei persoane, deci adresa e mereu </w:t>
+      </w:r>
+      <w:r>
+        <w:rPr>
+          <w:rFonts w:ascii="Consolas" w:hAnsi="Consolas" w:eastAsia="Consolas"/>
+          <w:sz w:val="24"/>
+        </w:rPr>
+        <w:t>bogdan@pandapc.ro</w:t>
+      </w:r>
+      <w:r>
+        <w:rPr>
+          <w:b w:val="0"/>
+          <w:sz w:val="24"/>
+        </w:rPr>
+        <w:t>.</w:t>
+      </w:r>
+    </w:p>
+    <w:p>
+      <w:pPr>
+        <w:spacing w:after="60" w:before="0"/>
+        <w:ind w:left="454" w:hanging="283"/>
+      </w:pPr>
+      <w:r>
+        <w:rPr>
+          <w:b w:val="0"/>
+          <w:sz w:val="24"/>
+        </w:rPr>
+        <w:t xml:space="preserve">2. Deschide e-mailul tău și apasă </w:t>
       </w:r>
       <w:r>
         <w:rPr>
@@ -898,20 +1317,7 @@
           <w:b w:val="0"/>
           <w:sz w:val="24"/>
         </w:rPr>
-        <w:t xml:space="preserve"> (New mail / Compose).</w:t>
-      </w:r>
-    </w:p>
-    <w:p>
-      <w:pPr>
-        <w:spacing w:after="60" w:before="0"/>
-        <w:ind w:left="454" w:hanging="283"/>
-      </w:pPr>
-      <w:r>
-        <w:rPr>
-          <w:b w:val="0"/>
-          <w:sz w:val="24"/>
-        </w:rPr>
-        <w:t xml:space="preserve">2. </w:t>
+        <w:t xml:space="preserve"> (New mail / Compose). </w:t>
       </w:r>
       <w:r>
         <w:rPr>
@@ -960,14 +1366,14 @@
           <w:rFonts w:ascii="Consolas" w:hAnsi="Consolas" w:eastAsia="Consolas"/>
           <w:sz w:val="24"/>
         </w:rPr>
-        <w:t>E33 – Simulare examen – Nume Prenume</w:t>
+        <w:t>E33 – Simulare examen – Varianta X – Nume Prenume</w:t>
       </w:r>
       <w:r>
         <w:rPr>
           <w:b w:val="0"/>
           <w:sz w:val="24"/>
         </w:rPr>
-        <w:t>, cu numele tău.</w:t>
+        <w:t>, cu litera variantei și numele tău.</w:t>
       </w:r>
     </w:p>
     <w:p>
@@ -994,7 +1400,21 @@
           <w:b w:val="0"/>
           <w:sz w:val="24"/>
         </w:rPr>
-        <w:t>, în 4–6 rânduri: adresare formală; ce trimiți („rezultatul simulării probei practice: căutarea despre autentificarea în doi pași”); o propoziție cu verdictul tău despre sursă; o cerere („Vă rog să-mi spuneți dacă…”); încheiere și semnătură (nume, grupa).</w:t>
+        <w:t xml:space="preserve">, în 4–6 rânduri: adresare formală, potrivită destinatarului; ce trimiți; o propoziție cu verdictul tău despre sursă; </w:t>
+      </w:r>
+      <w:r>
+        <w:rPr>
+          <w:b/>
+          <w:sz w:val="24"/>
+        </w:rPr>
+        <w:t>cererea</w:t>
+      </w:r>
+      <w:r>
+        <w:rPr>
+          <w:b w:val="0"/>
+          <w:sz w:val="24"/>
+        </w:rPr>
+        <w:t xml:space="preserve"> din varianta ta (părerea, o întrebare sau o propunere); încheiere și semnătură (nume, grupa).</w:t>
       </w:r>
     </w:p>
     <w:p>
@@ -1268,7 +1688,7 @@
           <w:b w:val="0"/>
           <w:sz w:val="24"/>
         </w:rPr>
-        <w:t>3. Ai depășit 55 de minute? Notează unde ai pierdut timpul: de obicei la alegerea sursei sau la formularea e-mailului.</w:t>
+        <w:t>3. Ai terminat mai repede? Fă și o altă variantă, doar Cerința 1, fără să o trimiți.</w:t>
       </w:r>
     </w:p>
     <w:p>
@@ -1295,6 +1715,19 @@
           <w:b w:val="0"/>
           <w:sz w:val="24"/>
         </w:rPr>
+        <w:t>☐ Ai lucrat pe varianta ta (A, B sau C), iar litera apare în subiectul e-mailului.</w:t>
+      </w:r>
+    </w:p>
+    <w:p>
+      <w:pPr>
+        <w:spacing w:after="40" w:before="0"/>
+        <w:ind w:left="454" w:hanging="283"/>
+      </w:pPr>
+      <w:r>
+        <w:rPr>
+          <w:b w:val="0"/>
+          <w:sz w:val="24"/>
+        </w:rPr>
         <w:t>☐ Tabelul de la cerința 1 are toate cele 8 rânduri completate, cu adresa completă a site-ului.</w:t>
       </w:r>
     </w:p>
@@ -1308,7 +1741,7 @@
           <w:b w:val="0"/>
           <w:sz w:val="24"/>
         </w:rPr>
-        <w:t>☐ Verdictul are cel puțin 3 motive și o a doua sursă care confirmă.</w:t>
+        <w:t>☐ Verdictul are cel puțin 3 motive și o a doua sursă care confirmă. Ai captura cu pagina de rezultate.</w:t>
       </w:r>
     </w:p>
     <w:p>
@@ -1321,20 +1754,7 @@
           <w:b w:val="0"/>
           <w:sz w:val="24"/>
         </w:rPr>
-        <w:t>☐ Ai captura cu pagina de rezultate.</w:t>
-      </w:r>
-    </w:p>
-    <w:p>
-      <w:pPr>
-        <w:spacing w:after="40" w:before="0"/>
-        <w:ind w:left="454" w:hanging="283"/>
-      </w:pPr>
-      <w:r>
-        <w:rPr>
-          <w:b w:val="0"/>
-          <w:sz w:val="24"/>
-        </w:rPr>
-        <w:t>☐ E-mailul are subiectul exact, adresare formală, conținut, cerere, încheiere, semnătură și atașamentul.</w:t>
+        <w:t>☐ E-mailul are adresare potrivită destinatarului, conținut, cererea din varianta ta, încheiere, semnătură și atașamentul.</w:t>
       </w:r>
     </w:p>
     <w:p>
@@ -1408,7 +1828,7 @@
           <w:b/>
           <w:sz w:val="24"/>
         </w:rPr>
-        <w:t>E33 – Simulare examen – Nume Prenume</w:t>
+        <w:t>E33 – Simulare examen – Varianta X – Nume Prenume</w:t>
       </w:r>
       <w:r>
         <w:rPr>

</xml_diff>